<commit_message>
docs: leyenda explicando "Clerk" + íconos para auth/multipart en Endpoints.docx
Aclara qué significa cada anotación (🔒 Clerk requiere Bearer JWT, 🌍 público,
🤝 svix signature, 📎 multipart/form-data) para que el equipo frontend lea
el contrato sin ambigüedad.

Co-Authored-By: Claude Opus 4.7 <noreply@anthropic.com>
</commit_message>
<xml_diff>
--- a/docs/Endpoints.docx
+++ b/docs/Endpoints.docx
@@ -53,9 +53,35 @@
         <w:t>https://condor-laser-main-57c2c96.d2.zuplo.dev/</w:t>
       </w:r>
     </w:p>
+    <w:p/>
+    <w:p>
+      <w:pPr>
+        <w:pStyle w:val="Heading2"/>
+      </w:pPr>
+      <w:r>
+        <w:rPr>
+          <w:color w:val="1F4E79"/>
+        </w:rPr>
+        <w:t>Cómo leer los endpoints</w:t>
+      </w:r>
+    </w:p>
     <w:p>
       <w:r>
-        <w:t xml:space="preserve">Auth: </w:t>
+        <w:t>Cada endpoint indica entre paréntesis qué tipo de auth requiere:</w:t>
+      </w:r>
+    </w:p>
+    <w:p>
+      <w:pPr>
+        <w:pStyle w:val="ListBullet"/>
+      </w:pPr>
+      <w:r>
+        <w:rPr>
+          <w:b/>
+        </w:rPr>
+        <w:t>🔒 Clerk</w:t>
+      </w:r>
+      <w:r>
+        <w:t xml:space="preserve">  →  necesita header </w:t>
       </w:r>
       <w:r>
         <w:rPr>
@@ -64,7 +90,135 @@
         <w:t>Authorization: Bearer &lt;Clerk JWT&gt;</w:t>
       </w:r>
       <w:r>
-        <w:t xml:space="preserve"> en cada request (salvo endpoints públicos marcados).</w:t>
+        <w:t xml:space="preserve"> (el JWT lo emite Clerk al loguearse). Sin token, el backend devuelve 401.</w:t>
+      </w:r>
+    </w:p>
+    <w:p>
+      <w:pPr>
+        <w:pStyle w:val="ListBullet"/>
+      </w:pPr>
+      <w:r>
+        <w:rPr>
+          <w:b/>
+        </w:rPr>
+        <w:t>🔒 Clerk + ownership</w:t>
+      </w:r>
+      <w:r>
+        <w:t xml:space="preserve">  →  además del JWT, el backend verifica que el recurso </w:t>
+      </w:r>
+      <w:r>
+        <w:rPr>
+          <w:b/>
+        </w:rPr>
+        <w:t>pertenece al user</w:t>
+      </w:r>
+      <w:r>
+        <w:t xml:space="preserve"> del token. Ejemplo: si pedís </w:t>
+      </w:r>
+      <w:r>
+        <w:rPr>
+          <w:b/>
+        </w:rPr>
+        <w:t>GET /accounts/{id}</w:t>
+      </w:r>
+      <w:r>
+        <w:t xml:space="preserve"> y esa cuenta no es tuya → 404 (no 403, para no filtrar existencia).</w:t>
+      </w:r>
+    </w:p>
+    <w:p>
+      <w:pPr>
+        <w:pStyle w:val="ListBullet"/>
+      </w:pPr>
+      <w:r>
+        <w:rPr>
+          <w:b/>
+        </w:rPr>
+        <w:t>🌍 público</w:t>
+      </w:r>
+      <w:r>
+        <w:t xml:space="preserve">  →  no necesita auth. Usar libremente.</w:t>
+      </w:r>
+    </w:p>
+    <w:p>
+      <w:pPr>
+        <w:pStyle w:val="ListBullet"/>
+      </w:pPr>
+      <w:r>
+        <w:rPr>
+          <w:b/>
+        </w:rPr>
+        <w:t>🤝 svix signature</w:t>
+      </w:r>
+      <w:r>
+        <w:t xml:space="preserve">  →  endpoint server-to-server. Verifica firma svix (no se llama desde el frontend).</w:t>
+      </w:r>
+    </w:p>
+    <w:p>
+      <w:pPr>
+        <w:pStyle w:val="ListBullet"/>
+      </w:pPr>
+      <w:r>
+        <w:rPr>
+          <w:b/>
+        </w:rPr>
+        <w:t>📎 multipart/form-data</w:t>
+      </w:r>
+      <w:r>
+        <w:t xml:space="preserve">  →  request con archivo (PDF) + form fields, en vez de JSON. Igual requiere Clerk JWT.</w:t>
+      </w:r>
+    </w:p>
+    <w:p/>
+    <w:p>
+      <w:r>
+        <w:rPr>
+          <w:b/>
+        </w:rPr>
+        <w:t>Métodos HTTP con color:</w:t>
+      </w:r>
+    </w:p>
+    <w:p>
+      <w:pPr>
+        <w:pStyle w:val="ListBullet"/>
+      </w:pPr>
+      <w:r>
+        <w:rPr>
+          <w:b/>
+          <w:color w:val="008000"/>
+        </w:rPr>
+        <w:t xml:space="preserve">GET </w:t>
+      </w:r>
+      <w:r>
+        <w:t>→ lectura, no modifica nada</w:t>
+      </w:r>
+    </w:p>
+    <w:p>
+      <w:pPr>
+        <w:pStyle w:val="ListBullet"/>
+      </w:pPr>
+      <w:r>
+        <w:rPr>
+          <w:b/>
+          <w:color w:val="1F4E79"/>
+        </w:rPr>
+        <w:t xml:space="preserve">POST </w:t>
+      </w:r>
+      <w:r>
+        <w:t>→ crear recurso nuevo</w:t>
+      </w:r>
+    </w:p>
+    <w:p>
+      <w:pPr>
+        <w:pStyle w:val="ListBullet"/>
+      </w:pPr>
+      <w:r>
+        <w:rPr>
+          <w:b/>
+          <w:color w:val="C65D0A"/>
+        </w:rPr>
+        <w:t xml:space="preserve">PUT / PATCH </w:t>
+      </w:r>
+      <w:r>
+        <w:t>→ actualizar recurso existente</w:t>
       </w:r>
     </w:p>
     <w:p/>
@@ -113,7 +267,7 @@
         <w:rPr>
           <w:i/>
         </w:rPr>
-        <w:t xml:space="preserve">  (Clerk)</w:t>
+        <w:t xml:space="preserve">  (🔒 Clerk)</w:t>
       </w:r>
     </w:p>
     <w:p>
@@ -145,7 +299,7 @@
         <w:rPr>
           <w:i/>
         </w:rPr>
-        <w:t xml:space="preserve">  (Clerk)</w:t>
+        <w:t xml:space="preserve">  (🔒 Clerk)</w:t>
       </w:r>
     </w:p>
     <w:p>
@@ -188,7 +342,7 @@
         <w:rPr>
           <w:i/>
         </w:rPr>
-        <w:t xml:space="preserve">  (Clerk)</w:t>
+        <w:t xml:space="preserve">  (🔒 Clerk)</w:t>
       </w:r>
     </w:p>
     <w:p>
@@ -220,7 +374,7 @@
         <w:rPr>
           <w:i/>
         </w:rPr>
-        <w:t xml:space="preserve">  (Clerk)</w:t>
+        <w:t xml:space="preserve">  (🔒 Clerk)</w:t>
       </w:r>
     </w:p>
     <w:p>
@@ -277,7 +431,7 @@
         <w:rPr>
           <w:i/>
         </w:rPr>
-        <w:t xml:space="preserve">  (Clerk)</w:t>
+        <w:t xml:space="preserve">  (🔒 Clerk)</w:t>
       </w:r>
     </w:p>
     <w:p>
@@ -345,7 +499,7 @@
         <w:rPr>
           <w:i/>
         </w:rPr>
-        <w:t xml:space="preserve">  (Clerk)</w:t>
+        <w:t xml:space="preserve">  (🔒 Clerk)</w:t>
       </w:r>
     </w:p>
     <w:p>
@@ -377,7 +531,7 @@
         <w:rPr>
           <w:i/>
         </w:rPr>
-        <w:t xml:space="preserve">  (Clerk)</w:t>
+        <w:t xml:space="preserve">  (🔒 Clerk)</w:t>
       </w:r>
     </w:p>
     <w:p>
@@ -445,7 +599,7 @@
         <w:rPr>
           <w:i/>
         </w:rPr>
-        <w:t xml:space="preserve">  (Clerk)</w:t>
+        <w:t xml:space="preserve">  (🔒 Clerk)</w:t>
       </w:r>
     </w:p>
     <w:p>
@@ -477,7 +631,7 @@
         <w:rPr>
           <w:i/>
         </w:rPr>
-        <w:t xml:space="preserve">  (Clerk)</w:t>
+        <w:t xml:space="preserve">  (🔒 Clerk)</w:t>
       </w:r>
     </w:p>
     <w:p>
@@ -534,7 +688,7 @@
         <w:rPr>
           <w:i/>
         </w:rPr>
-        <w:t xml:space="preserve">  (Clerk + ownership)</w:t>
+        <w:t xml:space="preserve">  (🔒 Clerk + ownership)</w:t>
       </w:r>
     </w:p>
     <w:p>
@@ -566,7 +720,7 @@
         <w:rPr>
           <w:i/>
         </w:rPr>
-        <w:t xml:space="preserve">  (Clerk + ownership)</w:t>
+        <w:t xml:space="preserve">  (🔒 Clerk + ownership)</w:t>
       </w:r>
     </w:p>
     <w:p>
@@ -609,7 +763,7 @@
         <w:rPr>
           <w:i/>
         </w:rPr>
-        <w:t xml:space="preserve">  (Clerk + ownership)</w:t>
+        <w:t xml:space="preserve">  (🔒 Clerk + ownership)</w:t>
       </w:r>
     </w:p>
     <w:p>
@@ -641,7 +795,7 @@
         <w:rPr>
           <w:i/>
         </w:rPr>
-        <w:t xml:space="preserve">  (Clerk + ownership)</w:t>
+        <w:t xml:space="preserve">  (🔒 Clerk + ownership)</w:t>
       </w:r>
     </w:p>
     <w:p>
@@ -673,7 +827,7 @@
         <w:rPr>
           <w:i/>
         </w:rPr>
-        <w:t xml:space="preserve">  (Clerk + ownership)</w:t>
+        <w:t xml:space="preserve">  (🔒 Clerk + ownership)</w:t>
       </w:r>
     </w:p>
     <w:p>
@@ -730,7 +884,7 @@
         <w:rPr>
           <w:i/>
         </w:rPr>
-        <w:t xml:space="preserve">  (Clerk)</w:t>
+        <w:t xml:space="preserve">  (🔒 Clerk)</w:t>
       </w:r>
     </w:p>
     <w:p>
@@ -762,7 +916,7 @@
         <w:rPr>
           <w:i/>
         </w:rPr>
-        <w:t xml:space="preserve">  (Clerk)</w:t>
+        <w:t xml:space="preserve">  (🔒 Clerk)</w:t>
       </w:r>
     </w:p>
     <w:p>
@@ -794,7 +948,7 @@
         <w:rPr>
           <w:i/>
         </w:rPr>
-        <w:t xml:space="preserve">  (Clerk)</w:t>
+        <w:t xml:space="preserve">  (🔒 Clerk)</w:t>
       </w:r>
     </w:p>
     <w:p>
@@ -832,7 +986,7 @@
         <w:rPr>
           <w:i/>
         </w:rPr>
-        <w:t xml:space="preserve">  (Clerk)</w:t>
+        <w:t xml:space="preserve">  (🔒 Clerk)</w:t>
       </w:r>
     </w:p>
     <w:p>
@@ -864,7 +1018,7 @@
         <w:rPr>
           <w:i/>
         </w:rPr>
-        <w:t xml:space="preserve">  (Clerk)</w:t>
+        <w:t xml:space="preserve">  (🔒 Clerk)</w:t>
       </w:r>
     </w:p>
     <w:p>
@@ -896,7 +1050,7 @@
         <w:rPr>
           <w:i/>
         </w:rPr>
-        <w:t xml:space="preserve">  (Clerk)</w:t>
+        <w:t xml:space="preserve">  (🔒 Clerk)</w:t>
       </w:r>
     </w:p>
     <w:p>
@@ -928,7 +1082,7 @@
         <w:rPr>
           <w:i/>
         </w:rPr>
-        <w:t xml:space="preserve">  (Clerk + ownership)</w:t>
+        <w:t xml:space="preserve">  (🔒 Clerk + ownership)</w:t>
       </w:r>
     </w:p>
     <w:p>
@@ -966,7 +1120,7 @@
         <w:rPr>
           <w:i/>
         </w:rPr>
-        <w:t xml:space="preserve">  (Clerk)</w:t>
+        <w:t xml:space="preserve">  (🔒 Clerk)</w:t>
       </w:r>
     </w:p>
     <w:p>
@@ -1009,7 +1163,7 @@
         <w:rPr>
           <w:i/>
         </w:rPr>
-        <w:t xml:space="preserve">  (Clerk)</w:t>
+        <w:t xml:space="preserve">  (🔒 Clerk)</w:t>
       </w:r>
     </w:p>
     <w:p>
@@ -1047,7 +1201,7 @@
         <w:rPr>
           <w:i/>
         </w:rPr>
-        <w:t xml:space="preserve">  (Clerk + multipart/form-data)</w:t>
+        <w:t xml:space="preserve">  (🔒 Clerk + 📎 multipart/form-data)</w:t>
       </w:r>
     </w:p>
     <w:p>
@@ -1090,7 +1244,7 @@
         <w:rPr>
           <w:i/>
         </w:rPr>
-        <w:t xml:space="preserve">  (Clerk + multipart/form-data)</w:t>
+        <w:t xml:space="preserve">  (🔒 Clerk + 📎 multipart/form-data)</w:t>
       </w:r>
     </w:p>
     <w:p>
@@ -1133,7 +1287,7 @@
         <w:rPr>
           <w:i/>
         </w:rPr>
-        <w:t xml:space="preserve">  (Clerk + multipart/form-data)</w:t>
+        <w:t xml:space="preserve">  (🔒 Clerk + 📎 multipart/form-data)</w:t>
       </w:r>
     </w:p>
     <w:p>
@@ -1190,7 +1344,7 @@
         <w:rPr>
           <w:i/>
         </w:rPr>
-        <w:t xml:space="preserve">  (Clerk)</w:t>
+        <w:t xml:space="preserve">  (🔒 Clerk)</w:t>
       </w:r>
     </w:p>
     <w:p>
@@ -1290,7 +1444,7 @@
         <w:rPr>
           <w:i/>
         </w:rPr>
-        <w:t xml:space="preserve">  (público)</w:t>
+        <w:t xml:space="preserve">  (🌍 público)</w:t>
       </w:r>
     </w:p>
     <w:p>
@@ -1322,7 +1476,7 @@
         <w:rPr>
           <w:i/>
         </w:rPr>
-        <w:t xml:space="preserve">  (público)</w:t>
+        <w:t xml:space="preserve">  (🌍 público)</w:t>
       </w:r>
     </w:p>
     <w:p>
@@ -1359,7 +1513,7 @@
         <w:rPr>
           <w:i/>
         </w:rPr>
-        <w:t xml:space="preserve">  (Clerk)</w:t>
+        <w:t xml:space="preserve">  (🔒 Clerk)</w:t>
       </w:r>
     </w:p>
     <w:p>
@@ -1396,7 +1550,7 @@
         <w:rPr>
           <w:i/>
         </w:rPr>
-        <w:t xml:space="preserve">  (svix signature)</w:t>
+        <w:t xml:space="preserve">  (🤝 svix signature)</w:t>
       </w:r>
     </w:p>
     <w:p>
@@ -1444,7 +1598,7 @@
         <w:rPr>
           <w:i/>
         </w:rPr>
-        <w:t xml:space="preserve">  (Clerk)</w:t>
+        <w:t xml:space="preserve">  (🔒 Clerk)</w:t>
       </w:r>
     </w:p>
     <w:p>
@@ -1476,7 +1630,7 @@
         <w:rPr>
           <w:i/>
         </w:rPr>
-        <w:t xml:space="preserve">  (Clerk)</w:t>
+        <w:t xml:space="preserve">  (🔒 Clerk)</w:t>
       </w:r>
     </w:p>
     <w:p>
@@ -1519,7 +1673,7 @@
         <w:rPr>
           <w:i/>
         </w:rPr>
-        <w:t xml:space="preserve">  (Clerk + ownership)</w:t>
+        <w:t xml:space="preserve">  (🔒 Clerk + ownership)</w:t>
       </w:r>
     </w:p>
     <w:p>

</xml_diff>

<commit_message>
docs: actualizar contrato del portfolio dashboard
- docs/API_CONTRACT.md regenerado (incluye /portfolio/dashboard)
- docs/Endpoints.docx: sección 'Vista Portafolio / Dashboard' explica
  el contrato derivado del mock del frontend, qué entrega cada campo
  y cómo el front debe manejar single vs multi-currency.

Co-Authored-By: Claude Opus 4.7 <noreply@anthropic.com>
</commit_message>
<xml_diff>
--- a/docs/Endpoints.docx
+++ b/docs/Endpoints.docx
@@ -242,8 +242,59 @@
       </w:r>
     </w:p>
     <w:p>
+      <w:pPr>
+        <w:pStyle w:val="ListBullet"/>
+      </w:pPr>
+      <w:r>
+        <w:t>Contrato derivado del mock del frontend (portfolio-content.js + portfolio_snapshot.json): un único endpoint agregado /portfolio/dashboard devuelve summary + trend + account_distribution + positions en un solo response. Backend entrega data CRUDA (Decimal + ISO date); el frontend formatea con Intl. Sin FX: si el user tiene 1 sola currency los escalares total_value/invested/pnl son la suma honesta; si tiene múltiples, esos escalares vienen NULL y el frontend itera total_value_by_currency (1 card por moneda).</w:t>
+      </w:r>
+    </w:p>
+    <w:p>
       <w:r>
         <w:t>Endpoints:</w:t>
+      </w:r>
+    </w:p>
+    <w:p>
+      <w:pPr>
+        <w:pStyle w:val="ListBullet"/>
+      </w:pPr>
+      <w:r>
+        <w:rPr>
+          <w:b/>
+          <w:color w:val="008000"/>
+        </w:rPr>
+        <w:t xml:space="preserve">GET </w:t>
+      </w:r>
+      <w:r>
+        <w:rPr>
+          <w:b/>
+        </w:rPr>
+        <w:t>/portfolio/dashboard</w:t>
+      </w:r>
+      <w:r>
+        <w:rPr>
+          <w:i/>
+        </w:rPr>
+        <w:t xml:space="preserve">  (🔒 Clerk)</w:t>
+      </w:r>
+    </w:p>
+    <w:p>
+      <w:pPr>
+        <w:pStyle w:val="ListBullet2"/>
+      </w:pPr>
+      <w:r>
+        <w:t>→ PortfolioDashboard: {summary, trend, account_distribution, positions}</w:t>
+      </w:r>
+    </w:p>
+    <w:p>
+      <w:pPr>
+        <w:pStyle w:val="ListBullet2"/>
+      </w:pPr>
+      <w:r>
+        <w:rPr>
+          <w:i/>
+        </w:rPr>
+        <w:t xml:space="preserve">  Nota: summary: {total_value/total_invested/unrealized_pnl (null si multi-currency), total_value_by_currency/total_invested_by_currency/unrealized_pnl_by_currency (dicts {USD: …, CLP: …}), total_return_pct, active_positions, linked_accounts, last_snapshot_date}. trend: [{date, value}]. account_distribution: [{account_id, name, amount, percentage, currency}] (percentage normalizado por su currency). positions: PositionDerived computado on-the-fly desde transactions + asset_prices.</w:t>
       </w:r>
     </w:p>
     <w:p>

</xml_diff>

<commit_message>
feat(portfolio): POST /portfolio/rebuild + test E2E + fix cron secret
- POST /portfolio/rebuild (auth Clerk) recomputa snapshots+positions del
  user al instante. Pensado para llamar después de subir un PDF, sin
  esperar al cron diario. Sync (~3-7s), idempotente, scoped por clerk_id.
- Fase 7 del integration_test: flujo end-to-end PDF→ingest→rebuild→
  dashboard con asserts de cantidad de snapshots y total_value esperado
  + verificación de idempotencia.
- Fix del workflow portfolio_reconstruction.yml: usa el secret existente
  DATABASE_URL (config.py normaliza a asyncpg) en vez de uno inexistente.
- Docs regenerados con /portfolio/rebuild documentado.
</commit_message>
<xml_diff>
--- a/docs/Endpoints.docx
+++ b/docs/Endpoints.docx
@@ -295,6 +295,49 @@
           <w:i/>
         </w:rPr>
         <w:t xml:space="preserve">  Nota: summary: {total_value/total_invested/unrealized_pnl (null si multi-currency), total_value_by_currency/total_invested_by_currency/unrealized_pnl_by_currency (dicts {USD: …, CLP: …}), total_return_pct, active_positions, linked_accounts, last_snapshot_date}. trend: [{date, value}]. account_distribution: [{account_id, name, amount, percentage, currency}] (percentage normalizado por su currency). positions: PositionDerived computado on-the-fly desde transactions + asset_prices.</w:t>
+      </w:r>
+    </w:p>
+    <w:p>
+      <w:pPr>
+        <w:pStyle w:val="ListBullet"/>
+      </w:pPr>
+      <w:r>
+        <w:rPr>
+          <w:b/>
+          <w:color w:val="1F4E79"/>
+        </w:rPr>
+        <w:t xml:space="preserve">POST </w:t>
+      </w:r>
+      <w:r>
+        <w:rPr>
+          <w:b/>
+        </w:rPr>
+        <w:t>/portfolio/rebuild</w:t>
+      </w:r>
+      <w:r>
+        <w:rPr>
+          <w:i/>
+        </w:rPr>
+        <w:t xml:space="preserve">  (🔒 Clerk)</w:t>
+      </w:r>
+    </w:p>
+    <w:p>
+      <w:pPr>
+        <w:pStyle w:val="ListBullet2"/>
+      </w:pPr>
+      <w:r>
+        <w:t>→ {snapshots_persisted: int, positions_persisted: int}</w:t>
+      </w:r>
+    </w:p>
+    <w:p>
+      <w:pPr>
+        <w:pStyle w:val="ListBullet2"/>
+      </w:pPr>
+      <w:r>
+        <w:rPr>
+          <w:i/>
+        </w:rPr>
+        <w:t xml:space="preserve">  Nota: Recomputa snapshots + positions del user. Pensado para llamar desde el frontend después de subir un PDF (cuando se crearon transactions nuevas y el cron diario todavía no corrió). Sync, ~3-7s. Idempotente.</w:t>
       </w:r>
     </w:p>
     <w:p>

</xml_diff>

<commit_message>
refactor(portfolio): code review fixes + doc actualizado
Hallazgos del code review aplicados:
- portfolio_repo: borrar imports muertos (Iterable, text, Asset),
  simplificar _PairState.avg_cost (rama inalcanzable),
  reemplazar float(v) por str(v) en breakdowns JSONB (convención
  Decimal nunca-float), aclarar tx.kind=fee con condicional explícito
  en vez de 'fee or qty' (Decimal(0) es falsy y caía a qty),
  borrar comentario obvio en tx_idx,
  TODO sobre recompute redundante de positions (el cron ahora las
  materializa, pero el dashboard sigue llamando position_repo).
- schemas/portfolio: recortar docstrings excesivos vs convención
  del repo (account_repo, asset_repo usan 1-line docstrings).
- routers/portfolio: idem; queda un comentario explicando la
  decisión sync vs background.
- Endpoints.docx: quitar 5 rutas obsoletas (PATCH /profile/risk-profile,
  GET/PUT /user/risk_profile, GET/PUT /user/accounts_names) que
  PR #20 borró del backend y arrastraba el doc viejo.
</commit_message>
<xml_diff>
--- a/docs/Endpoints.docx
+++ b/docs/Endpoints.docx
@@ -1021,172 +1021,6 @@
         <w:t>→ Update profile (hoy permite editar risk_profile). Body: { risk_profile }</w:t>
       </w:r>
     </w:p>
-    <w:p>
-      <w:pPr>
-        <w:pStyle w:val="ListBullet"/>
-      </w:pPr>
-      <w:r>
-        <w:rPr>
-          <w:b/>
-          <w:color w:val="C65D0A"/>
-        </w:rPr>
-        <w:t xml:space="preserve">PATCH </w:t>
-      </w:r>
-      <w:r>
-        <w:rPr>
-          <w:b/>
-        </w:rPr>
-        <w:t>/profile/risk-profile</w:t>
-      </w:r>
-      <w:r>
-        <w:rPr>
-          <w:i/>
-        </w:rPr>
-        <w:t xml:space="preserve">  (🔒 Clerk)</w:t>
-      </w:r>
-    </w:p>
-    <w:p>
-      <w:pPr>
-        <w:pStyle w:val="ListBullet2"/>
-      </w:pPr>
-      <w:r>
-        <w:t>→ Canónico: actualiza solo el risk_profile. Body: { risk_profile }</w:t>
-      </w:r>
-    </w:p>
-    <w:p/>
-    <w:p>
-      <w:r>
-        <w:t>Endpoints — User (aliases livianos):</w:t>
-      </w:r>
-    </w:p>
-    <w:p>
-      <w:pPr>
-        <w:pStyle w:val="ListBullet"/>
-      </w:pPr>
-      <w:r>
-        <w:rPr>
-          <w:b/>
-          <w:color w:val="008000"/>
-        </w:rPr>
-        <w:t xml:space="preserve">GET </w:t>
-      </w:r>
-      <w:r>
-        <w:rPr>
-          <w:b/>
-        </w:rPr>
-        <w:t>/user/risk_profile</w:t>
-      </w:r>
-      <w:r>
-        <w:rPr>
-          <w:i/>
-        </w:rPr>
-        <w:t xml:space="preserve">  (🔒 Clerk)</w:t>
-      </w:r>
-    </w:p>
-    <w:p>
-      <w:pPr>
-        <w:pStyle w:val="ListBullet2"/>
-      </w:pPr>
-      <w:r>
-        <w:t>→ { risk_profile: 'moderate' | 'agressive' | 'conservative' | null }</w:t>
-      </w:r>
-    </w:p>
-    <w:p>
-      <w:pPr>
-        <w:pStyle w:val="ListBullet"/>
-      </w:pPr>
-      <w:r>
-        <w:rPr>
-          <w:b/>
-          <w:color w:val="C65D0A"/>
-        </w:rPr>
-        <w:t xml:space="preserve">PUT </w:t>
-      </w:r>
-      <w:r>
-        <w:rPr>
-          <w:b/>
-        </w:rPr>
-        <w:t>/user/risk_profile</w:t>
-      </w:r>
-      <w:r>
-        <w:rPr>
-          <w:i/>
-        </w:rPr>
-        <w:t xml:space="preserve">  (🔒 Clerk)</w:t>
-      </w:r>
-    </w:p>
-    <w:p>
-      <w:pPr>
-        <w:pStyle w:val="ListBullet2"/>
-      </w:pPr>
-      <w:r>
-        <w:t>→ Alias de PATCH /profile/risk-profile. Body: { risk_profile }</w:t>
-      </w:r>
-    </w:p>
-    <w:p>
-      <w:pPr>
-        <w:pStyle w:val="ListBullet"/>
-      </w:pPr>
-      <w:r>
-        <w:rPr>
-          <w:b/>
-          <w:color w:val="008000"/>
-        </w:rPr>
-        <w:t xml:space="preserve">GET </w:t>
-      </w:r>
-      <w:r>
-        <w:rPr>
-          <w:b/>
-        </w:rPr>
-        <w:t>/user/accounts_names</w:t>
-      </w:r>
-      <w:r>
-        <w:rPr>
-          <w:i/>
-        </w:rPr>
-        <w:t xml:space="preserve">  (🔒 Clerk)</w:t>
-      </w:r>
-    </w:p>
-    <w:p>
-      <w:pPr>
-        <w:pStyle w:val="ListBullet2"/>
-      </w:pPr>
-      <w:r>
-        <w:t>→ [ { id, name }, ... ] — solo id+nombre de cada cuenta</w:t>
-      </w:r>
-    </w:p>
-    <w:p>
-      <w:pPr>
-        <w:pStyle w:val="ListBullet"/>
-      </w:pPr>
-      <w:r>
-        <w:rPr>
-          <w:b/>
-          <w:color w:val="C65D0A"/>
-        </w:rPr>
-        <w:t xml:space="preserve">PUT </w:t>
-      </w:r>
-      <w:r>
-        <w:rPr>
-          <w:b/>
-        </w:rPr>
-        <w:t>/user/accounts_names</w:t>
-      </w:r>
-      <w:r>
-        <w:rPr>
-          <w:i/>
-        </w:rPr>
-        <w:t xml:space="preserve">  (🔒 Clerk + ownership)</w:t>
-      </w:r>
-    </w:p>
-    <w:p>
-      <w:pPr>
-        <w:pStyle w:val="ListBullet2"/>
-      </w:pPr>
-      <w:r>
-        <w:t>→ Rename batch. Body: [ { id, name }, ... ]</w:t>
-      </w:r>
-    </w:p>
     <w:p/>
     <w:p>
       <w:r>
@@ -1446,7 +1280,7 @@
         <w:pStyle w:val="ListBullet2"/>
       </w:pPr>
       <w:r>
-        <w:t>→ { risk_profile } — alias de PATCH /profile/risk-profile para uso en onboarding</w:t>
+        <w:t>→ { risk_profile } — setea risk_profile inicial del user en el onboarding</w:t>
       </w:r>
     </w:p>
     <w:p/>

</xml_diff>